<commit_message>
Remove Dr. from Somyot signature in every New Visa letter
</commit_message>
<xml_diff>
--- a/templates/Letter_Bachelor_Degree.docx
+++ b/templates/Letter_Bachelor_Degree.docx
@@ -1359,7 +1359,7 @@
           <w:sz w:val="24"/>
           <w:szCs w:val="32"/>
         </w:rPr>
-        <w:t xml:space="preserve">Asst. Prof. Dr. Somyot </w:t>
+        <w:t xml:space="preserve">Asst. Prof. Somyot </w:t>
       </w:r>
       <w:proofErr w:type="spellStart"/>
       <w:r>
@@ -2540,7 +2540,7 @@
           <w:sz w:val="24"/>
           <w:szCs w:val="32"/>
         </w:rPr>
-        <w:t xml:space="preserve">Asst. Prof. Dr. Somyot </w:t>
+        <w:t xml:space="preserve">Asst. Prof. Somyot </w:t>
       </w:r>
       <w:proofErr w:type="spellStart"/>
       <w:r>

</xml_diff>